<commit_message>
Clubs note v4: widen table columns
Co-Authored-By: Claude Sonnet 5.5 <noreply@anthropic.com>
Claude-Session: https://claude.ai/code/session_01NZxYRpYCJka2jQFTHvmGQ5
</commit_message>
<xml_diff>
--- a/Clubs_Extrascolaires_Note_Parents_BCBS_v4.docx
+++ b/Clubs_Extrascolaires_Note_Parents_BCBS_v4.docx
@@ -456,11 +456,11 @@
         <w:tblLook w:val="0000" w:firstRow="0" w:lastRow="0" w:firstColumn="0" w:lastColumn="0" w:noHBand="0" w:noVBand="0"/>
       </w:tblPr>
       <w:tblGrid>
+        <w:gridCol w:w="1550"/>
+        <w:gridCol w:w="3350"/>
+        <w:gridCol w:w="2100"/>
+        <w:gridCol w:w="1500"/>
         <w:gridCol w:w="1400"/>
-        <w:gridCol w:w="3700"/>
-        <w:gridCol w:w="2100"/>
-        <w:gridCol w:w="1200"/>
-        <w:gridCol w:w="1500"/>
       </w:tblGrid>
       <w:tr>
         <w:trPr>
@@ -469,7 +469,7 @@
         </w:trPr>
         <w:tc>
           <w:tcPr>
-            <w:tcW w:w="1400" w:type="dxa"/>
+            <w:tcW w:w="1550" w:type="dxa"/>
             <w:tcBorders>
               <w:top w:val="single" w:sz="4" w:space="0" w:color="317647"/>
               <w:left w:val="single" w:sz="4" w:space="0" w:color="A6A6A6"/>
@@ -505,7 +505,7 @@
         </w:tc>
         <w:tc>
           <w:tcPr>
-            <w:tcW w:w="3700" w:type="dxa"/>
+            <w:tcW w:w="3350" w:type="dxa"/>
             <w:tcBorders>
               <w:top w:val="single" w:sz="4" w:space="0" w:color="317647"/>
               <w:left w:val="single" w:sz="4" w:space="0" w:color="A6A6A6"/>
@@ -577,7 +577,7 @@
         </w:tc>
         <w:tc>
           <w:tcPr>
-            <w:tcW w:w="1200" w:type="dxa"/>
+            <w:tcW w:w="1500" w:type="dxa"/>
             <w:tcBorders>
               <w:top w:val="single" w:sz="4" w:space="0" w:color="317647"/>
               <w:left w:val="single" w:sz="4" w:space="0" w:color="A6A6A6"/>
@@ -613,7 +613,7 @@
         </w:tc>
         <w:tc>
           <w:tcPr>
-            <w:tcW w:w="1500" w:type="dxa"/>
+            <w:tcW w:w="1400" w:type="dxa"/>
             <w:tcBorders>
               <w:top w:val="single" w:sz="4" w:space="0" w:color="317647"/>
               <w:left w:val="single" w:sz="4" w:space="0" w:color="A6A6A6"/>
@@ -654,7 +654,7 @@
         </w:trPr>
         <w:tc>
           <w:tcPr>
-            <w:tcW w:w="1400" w:type="dxa"/>
+            <w:tcW w:w="1550" w:type="dxa"/>
             <w:tcBorders>
               <w:top w:val="single" w:sz="18" w:space="0" w:color="317647"/>
               <w:left w:val="single" w:sz="4" w:space="0" w:color="A6A6A6"/>
@@ -688,7 +688,7 @@
         </w:tc>
         <w:tc>
           <w:tcPr>
-            <w:tcW w:w="3700" w:type="dxa"/>
+            <w:tcW w:w="3350" w:type="dxa"/>
             <w:vMerge w:val="restart"/>
             <w:tcBorders>
               <w:top w:val="single" w:sz="18" w:space="0" w:color="317647"/>
@@ -771,7 +771,7 @@
         </w:tc>
         <w:tc>
           <w:tcPr>
-            <w:tcW w:w="1200" w:type="dxa"/>
+            <w:tcW w:w="1500" w:type="dxa"/>
             <w:tcBorders>
               <w:top w:val="single" w:sz="18" w:space="0" w:color="317647"/>
               <w:left w:val="single" w:sz="4" w:space="0" w:color="A6A6A6"/>
@@ -802,7 +802,7 @@
         </w:tc>
         <w:tc>
           <w:tcPr>
-            <w:tcW w:w="1500" w:type="dxa"/>
+            <w:tcW w:w="1400" w:type="dxa"/>
             <w:tcBorders>
               <w:top w:val="single" w:sz="18" w:space="0" w:color="317647"/>
               <w:left w:val="single" w:sz="4" w:space="0" w:color="A6A6A6"/>
@@ -842,7 +842,7 @@
         </w:trPr>
         <w:tc>
           <w:tcPr>
-            <w:tcW w:w="1400" w:type="dxa"/>
+            <w:tcW w:w="1550" w:type="dxa"/>
             <w:tcBorders>
               <w:top w:val="single" w:sz="18" w:space="0" w:color="317647"/>
               <w:left w:val="single" w:sz="4" w:space="0" w:color="A6A6A6"/>
@@ -876,7 +876,7 @@
         </w:tc>
         <w:tc>
           <w:tcPr>
-            <w:tcW w:w="3700" w:type="dxa"/>
+            <w:tcW w:w="3350" w:type="dxa"/>
             <w:vMerge w:val="restart"/>
             <w:tcBorders>
               <w:top w:val="single" w:sz="18" w:space="0" w:color="317647"/>
@@ -959,7 +959,7 @@
         </w:tc>
         <w:tc>
           <w:tcPr>
-            <w:tcW w:w="1200" w:type="dxa"/>
+            <w:tcW w:w="1500" w:type="dxa"/>
             <w:tcBorders>
               <w:top w:val="single" w:sz="18" w:space="0" w:color="317647"/>
               <w:left w:val="single" w:sz="4" w:space="0" w:color="A6A6A6"/>
@@ -990,7 +990,7 @@
         </w:tc>
         <w:tc>
           <w:tcPr>
-            <w:tcW w:w="1500" w:type="dxa"/>
+            <w:tcW w:w="1400" w:type="dxa"/>
             <w:tcBorders>
               <w:top w:val="single" w:sz="18" w:space="0" w:color="317647"/>
               <w:left w:val="single" w:sz="4" w:space="0" w:color="A6A6A6"/>
@@ -1030,7 +1030,7 @@
         </w:trPr>
         <w:tc>
           <w:tcPr>
-            <w:tcW w:w="1400" w:type="dxa"/>
+            <w:tcW w:w="1550" w:type="dxa"/>
             <w:tcBorders>
               <w:top w:val="single" w:sz="18" w:space="0" w:color="317647"/>
               <w:left w:val="single" w:sz="4" w:space="0" w:color="A6A6A6"/>
@@ -1064,7 +1064,7 @@
         </w:tc>
         <w:tc>
           <w:tcPr>
-            <w:tcW w:w="3700" w:type="dxa"/>
+            <w:tcW w:w="3350" w:type="dxa"/>
             <w:vMerge w:val="restart"/>
             <w:tcBorders>
               <w:top w:val="single" w:sz="18" w:space="0" w:color="317647"/>
@@ -1147,7 +1147,7 @@
         </w:tc>
         <w:tc>
           <w:tcPr>
-            <w:tcW w:w="1200" w:type="dxa"/>
+            <w:tcW w:w="1500" w:type="dxa"/>
             <w:tcBorders>
               <w:top w:val="single" w:sz="18" w:space="0" w:color="317647"/>
               <w:left w:val="single" w:sz="4" w:space="0" w:color="A6A6A6"/>
@@ -1178,7 +1178,7 @@
         </w:tc>
         <w:tc>
           <w:tcPr>
-            <w:tcW w:w="1500" w:type="dxa"/>
+            <w:tcW w:w="1400" w:type="dxa"/>
             <w:tcBorders>
               <w:top w:val="single" w:sz="18" w:space="0" w:color="317647"/>
               <w:left w:val="single" w:sz="4" w:space="0" w:color="A6A6A6"/>
@@ -1218,7 +1218,7 @@
         </w:trPr>
         <w:tc>
           <w:tcPr>
-            <w:tcW w:w="1400" w:type="dxa"/>
+            <w:tcW w:w="1550" w:type="dxa"/>
             <w:vMerge w:val="restart"/>
             <w:tcBorders>
               <w:top w:val="single" w:sz="18" w:space="0" w:color="317647"/>
@@ -1253,7 +1253,7 @@
         </w:tc>
         <w:tc>
           <w:tcPr>
-            <w:tcW w:w="3700" w:type="dxa"/>
+            <w:tcW w:w="3350" w:type="dxa"/>
             <w:vMerge w:val="restart"/>
             <w:tcBorders>
               <w:top w:val="single" w:sz="18" w:space="0" w:color="317647"/>
@@ -1336,7 +1336,7 @@
         </w:tc>
         <w:tc>
           <w:tcPr>
-            <w:tcW w:w="1200" w:type="dxa"/>
+            <w:tcW w:w="1500" w:type="dxa"/>
             <w:tcBorders>
               <w:top w:val="single" w:sz="18" w:space="0" w:color="317647"/>
               <w:left w:val="single" w:sz="4" w:space="0" w:color="A6A6A6"/>
@@ -1367,7 +1367,7 @@
         </w:tc>
         <w:tc>
           <w:tcPr>
-            <w:tcW w:w="1500" w:type="dxa"/>
+            <w:tcW w:w="1400" w:type="dxa"/>
             <w:tcBorders>
               <w:top w:val="single" w:sz="18" w:space="0" w:color="317647"/>
               <w:left w:val="single" w:sz="4" w:space="0" w:color="A6A6A6"/>
@@ -1407,7 +1407,7 @@
         </w:trPr>
         <w:tc>
           <w:tcPr>
-            <w:tcW w:w="1400" w:type="dxa"/>
+            <w:tcW w:w="1550" w:type="dxa"/>
             <w:vMerge/>
             <w:tcBorders>
               <w:top w:val="single" w:sz="4" w:space="0" w:color="A6A6A6"/>
@@ -1431,7 +1431,7 @@
         </w:tc>
         <w:tc>
           <w:tcPr>
-            <w:tcW w:w="3700" w:type="dxa"/>
+            <w:tcW w:w="3350" w:type="dxa"/>
             <w:vMerge/>
             <w:tcBorders>
               <w:top w:val="single" w:sz="4" w:space="0" w:color="A6A6A6"/>
@@ -1486,7 +1486,7 @@
         </w:tc>
         <w:tc>
           <w:tcPr>
-            <w:tcW w:w="1200" w:type="dxa"/>
+            <w:tcW w:w="1500" w:type="dxa"/>
             <w:tcBorders>
               <w:top w:val="single" w:sz="4" w:space="0" w:color="A6A6A6"/>
               <w:left w:val="single" w:sz="4" w:space="0" w:color="A6A6A6"/>
@@ -1517,7 +1517,7 @@
         </w:tc>
         <w:tc>
           <w:tcPr>
-            <w:tcW w:w="1500" w:type="dxa"/>
+            <w:tcW w:w="1400" w:type="dxa"/>
             <w:tcBorders>
               <w:top w:val="single" w:sz="4" w:space="0" w:color="A6A6A6"/>
               <w:left w:val="single" w:sz="4" w:space="0" w:color="A6A6A6"/>
@@ -1557,7 +1557,7 @@
         </w:trPr>
         <w:tc>
           <w:tcPr>
-            <w:tcW w:w="1400" w:type="dxa"/>
+            <w:tcW w:w="1550" w:type="dxa"/>
             <w:vMerge/>
             <w:tcBorders>
               <w:top w:val="single" w:sz="4" w:space="0" w:color="A6A6A6"/>
@@ -1581,7 +1581,7 @@
         </w:tc>
         <w:tc>
           <w:tcPr>
-            <w:tcW w:w="3700" w:type="dxa"/>
+            <w:tcW w:w="3350" w:type="dxa"/>
             <w:vMerge/>
             <w:tcBorders>
               <w:top w:val="single" w:sz="4" w:space="0" w:color="A6A6A6"/>
@@ -1636,7 +1636,7 @@
         </w:tc>
         <w:tc>
           <w:tcPr>
-            <w:tcW w:w="1200" w:type="dxa"/>
+            <w:tcW w:w="1500" w:type="dxa"/>
             <w:tcBorders>
               <w:top w:val="single" w:sz="4" w:space="0" w:color="A6A6A6"/>
               <w:left w:val="single" w:sz="4" w:space="0" w:color="A6A6A6"/>
@@ -1667,7 +1667,7 @@
         </w:tc>
         <w:tc>
           <w:tcPr>
-            <w:tcW w:w="1500" w:type="dxa"/>
+            <w:tcW w:w="1400" w:type="dxa"/>
             <w:tcBorders>
               <w:top w:val="single" w:sz="4" w:space="0" w:color="A6A6A6"/>
               <w:left w:val="single" w:sz="4" w:space="0" w:color="A6A6A6"/>
@@ -1707,7 +1707,7 @@
         </w:trPr>
         <w:tc>
           <w:tcPr>
-            <w:tcW w:w="1400" w:type="dxa"/>
+            <w:tcW w:w="1550" w:type="dxa"/>
             <w:vMerge/>
             <w:tcBorders>
               <w:top w:val="single" w:sz="4" w:space="0" w:color="A6A6A6"/>
@@ -1731,7 +1731,7 @@
         </w:tc>
         <w:tc>
           <w:tcPr>
-            <w:tcW w:w="3700" w:type="dxa"/>
+            <w:tcW w:w="3350" w:type="dxa"/>
             <w:vMerge/>
             <w:tcBorders>
               <w:top w:val="single" w:sz="4" w:space="0" w:color="A6A6A6"/>
@@ -1786,7 +1786,7 @@
         </w:tc>
         <w:tc>
           <w:tcPr>
-            <w:tcW w:w="1200" w:type="dxa"/>
+            <w:tcW w:w="1500" w:type="dxa"/>
             <w:tcBorders>
               <w:top w:val="single" w:sz="4" w:space="0" w:color="A6A6A6"/>
               <w:left w:val="single" w:sz="4" w:space="0" w:color="A6A6A6"/>
@@ -1817,7 +1817,7 @@
         </w:tc>
         <w:tc>
           <w:tcPr>
-            <w:tcW w:w="1500" w:type="dxa"/>
+            <w:tcW w:w="1400" w:type="dxa"/>
             <w:tcBorders>
               <w:top w:val="single" w:sz="4" w:space="0" w:color="A6A6A6"/>
               <w:left w:val="single" w:sz="4" w:space="0" w:color="A6A6A6"/>
@@ -1857,7 +1857,7 @@
         </w:trPr>
         <w:tc>
           <w:tcPr>
-            <w:tcW w:w="1400" w:type="dxa"/>
+            <w:tcW w:w="1550" w:type="dxa"/>
             <w:vMerge w:val="restart"/>
             <w:tcBorders>
               <w:top w:val="single" w:sz="18" w:space="0" w:color="317647"/>
@@ -1892,7 +1892,7 @@
         </w:tc>
         <w:tc>
           <w:tcPr>
-            <w:tcW w:w="3700" w:type="dxa"/>
+            <w:tcW w:w="3350" w:type="dxa"/>
             <w:vMerge w:val="restart"/>
             <w:tcBorders>
               <w:top w:val="single" w:sz="18" w:space="0" w:color="317647"/>
@@ -1975,7 +1975,7 @@
         </w:tc>
         <w:tc>
           <w:tcPr>
-            <w:tcW w:w="1200" w:type="dxa"/>
+            <w:tcW w:w="1500" w:type="dxa"/>
             <w:tcBorders>
               <w:top w:val="single" w:sz="18" w:space="0" w:color="317647"/>
               <w:left w:val="single" w:sz="4" w:space="0" w:color="A6A6A6"/>
@@ -2006,7 +2006,7 @@
         </w:tc>
         <w:tc>
           <w:tcPr>
-            <w:tcW w:w="1500" w:type="dxa"/>
+            <w:tcW w:w="1400" w:type="dxa"/>
             <w:tcBorders>
               <w:top w:val="single" w:sz="18" w:space="0" w:color="317647"/>
               <w:left w:val="single" w:sz="4" w:space="0" w:color="A6A6A6"/>
@@ -2046,7 +2046,7 @@
         </w:trPr>
         <w:tc>
           <w:tcPr>
-            <w:tcW w:w="1400" w:type="dxa"/>
+            <w:tcW w:w="1550" w:type="dxa"/>
             <w:vMerge/>
             <w:tcBorders>
               <w:top w:val="single" w:sz="4" w:space="0" w:color="A6A6A6"/>
@@ -2070,7 +2070,7 @@
         </w:tc>
         <w:tc>
           <w:tcPr>
-            <w:tcW w:w="3700" w:type="dxa"/>
+            <w:tcW w:w="3350" w:type="dxa"/>
             <w:vMerge/>
             <w:tcBorders>
               <w:top w:val="single" w:sz="4" w:space="0" w:color="A6A6A6"/>
@@ -2125,7 +2125,7 @@
         </w:tc>
         <w:tc>
           <w:tcPr>
-            <w:tcW w:w="1200" w:type="dxa"/>
+            <w:tcW w:w="1500" w:type="dxa"/>
             <w:tcBorders>
               <w:top w:val="single" w:sz="4" w:space="0" w:color="A6A6A6"/>
               <w:left w:val="single" w:sz="4" w:space="0" w:color="A6A6A6"/>
@@ -2156,7 +2156,7 @@
         </w:tc>
         <w:tc>
           <w:tcPr>
-            <w:tcW w:w="1500" w:type="dxa"/>
+            <w:tcW w:w="1400" w:type="dxa"/>
             <w:tcBorders>
               <w:top w:val="single" w:sz="4" w:space="0" w:color="A6A6A6"/>
               <w:left w:val="single" w:sz="4" w:space="0" w:color="A6A6A6"/>
@@ -2196,7 +2196,7 @@
         </w:trPr>
         <w:tc>
           <w:tcPr>
-            <w:tcW w:w="1400" w:type="dxa"/>
+            <w:tcW w:w="1550" w:type="dxa"/>
             <w:vMerge/>
             <w:tcBorders>
               <w:top w:val="single" w:sz="4" w:space="0" w:color="A6A6A6"/>
@@ -2220,7 +2220,7 @@
         </w:tc>
         <w:tc>
           <w:tcPr>
-            <w:tcW w:w="3700" w:type="dxa"/>
+            <w:tcW w:w="3350" w:type="dxa"/>
             <w:vMerge/>
             <w:tcBorders>
               <w:top w:val="single" w:sz="4" w:space="0" w:color="A6A6A6"/>
@@ -2275,7 +2275,7 @@
         </w:tc>
         <w:tc>
           <w:tcPr>
-            <w:tcW w:w="1200" w:type="dxa"/>
+            <w:tcW w:w="1500" w:type="dxa"/>
             <w:tcBorders>
               <w:top w:val="single" w:sz="4" w:space="0" w:color="A6A6A6"/>
               <w:left w:val="single" w:sz="4" w:space="0" w:color="A6A6A6"/>
@@ -2306,7 +2306,7 @@
         </w:tc>
         <w:tc>
           <w:tcPr>
-            <w:tcW w:w="1500" w:type="dxa"/>
+            <w:tcW w:w="1400" w:type="dxa"/>
             <w:tcBorders>
               <w:top w:val="single" w:sz="4" w:space="0" w:color="A6A6A6"/>
               <w:left w:val="single" w:sz="4" w:space="0" w:color="A6A6A6"/>
@@ -2346,7 +2346,7 @@
         </w:trPr>
         <w:tc>
           <w:tcPr>
-            <w:tcW w:w="1400" w:type="dxa"/>
+            <w:tcW w:w="1550" w:type="dxa"/>
             <w:vMerge/>
             <w:tcBorders>
               <w:top w:val="single" w:sz="4" w:space="0" w:color="A6A6A6"/>
@@ -2370,7 +2370,7 @@
         </w:tc>
         <w:tc>
           <w:tcPr>
-            <w:tcW w:w="3700" w:type="dxa"/>
+            <w:tcW w:w="3350" w:type="dxa"/>
             <w:vMerge/>
             <w:tcBorders>
               <w:top w:val="single" w:sz="4" w:space="0" w:color="A6A6A6"/>
@@ -2425,7 +2425,7 @@
         </w:tc>
         <w:tc>
           <w:tcPr>
-            <w:tcW w:w="1200" w:type="dxa"/>
+            <w:tcW w:w="1500" w:type="dxa"/>
             <w:tcBorders>
               <w:top w:val="single" w:sz="4" w:space="0" w:color="A6A6A6"/>
               <w:left w:val="single" w:sz="4" w:space="0" w:color="A6A6A6"/>
@@ -2456,7 +2456,7 @@
         </w:tc>
         <w:tc>
           <w:tcPr>
-            <w:tcW w:w="1500" w:type="dxa"/>
+            <w:tcW w:w="1400" w:type="dxa"/>
             <w:tcBorders>
               <w:top w:val="single" w:sz="4" w:space="0" w:color="A6A6A6"/>
               <w:left w:val="single" w:sz="4" w:space="0" w:color="A6A6A6"/>
@@ -2496,7 +2496,7 @@
         </w:trPr>
         <w:tc>
           <w:tcPr>
-            <w:tcW w:w="1400" w:type="dxa"/>
+            <w:tcW w:w="1550" w:type="dxa"/>
             <w:vMerge w:val="restart"/>
             <w:tcBorders>
               <w:top w:val="single" w:sz="18" w:space="0" w:color="317647"/>
@@ -2531,7 +2531,7 @@
         </w:tc>
         <w:tc>
           <w:tcPr>
-            <w:tcW w:w="3700" w:type="dxa"/>
+            <w:tcW w:w="3350" w:type="dxa"/>
             <w:vMerge w:val="restart"/>
             <w:tcBorders>
               <w:top w:val="single" w:sz="18" w:space="0" w:color="317647"/>
@@ -2614,7 +2614,7 @@
         </w:tc>
         <w:tc>
           <w:tcPr>
-            <w:tcW w:w="1200" w:type="dxa"/>
+            <w:tcW w:w="1500" w:type="dxa"/>
             <w:tcBorders>
               <w:top w:val="single" w:sz="18" w:space="0" w:color="317647"/>
               <w:left w:val="single" w:sz="4" w:space="0" w:color="A6A6A6"/>
@@ -2645,7 +2645,7 @@
         </w:tc>
         <w:tc>
           <w:tcPr>
-            <w:tcW w:w="1500" w:type="dxa"/>
+            <w:tcW w:w="1400" w:type="dxa"/>
             <w:tcBorders>
               <w:top w:val="single" w:sz="18" w:space="0" w:color="317647"/>
               <w:left w:val="single" w:sz="4" w:space="0" w:color="A6A6A6"/>
@@ -2702,7 +2702,7 @@
         </w:trPr>
         <w:tc>
           <w:tcPr>
-            <w:tcW w:w="1400" w:type="dxa"/>
+            <w:tcW w:w="1550" w:type="dxa"/>
             <w:vMerge/>
             <w:tcBorders>
               <w:top w:val="single" w:sz="4" w:space="0" w:color="A6A6A6"/>
@@ -2726,7 +2726,7 @@
         </w:tc>
         <w:tc>
           <w:tcPr>
-            <w:tcW w:w="3700" w:type="dxa"/>
+            <w:tcW w:w="3350" w:type="dxa"/>
             <w:vMerge/>
             <w:tcBorders>
               <w:top w:val="single" w:sz="4" w:space="0" w:color="A6A6A6"/>
@@ -2781,7 +2781,7 @@
         </w:tc>
         <w:tc>
           <w:tcPr>
-            <w:tcW w:w="1200" w:type="dxa"/>
+            <w:tcW w:w="1500" w:type="dxa"/>
             <w:tcBorders>
               <w:top w:val="single" w:sz="4" w:space="0" w:color="A6A6A6"/>
               <w:left w:val="single" w:sz="4" w:space="0" w:color="A6A6A6"/>
@@ -2812,7 +2812,7 @@
         </w:tc>
         <w:tc>
           <w:tcPr>
-            <w:tcW w:w="1500" w:type="dxa"/>
+            <w:tcW w:w="1400" w:type="dxa"/>
             <w:tcBorders>
               <w:top w:val="single" w:sz="4" w:space="0" w:color="A6A6A6"/>
               <w:left w:val="single" w:sz="4" w:space="0" w:color="A6A6A6"/>
@@ -2869,7 +2869,7 @@
         </w:trPr>
         <w:tc>
           <w:tcPr>
-            <w:tcW w:w="1400" w:type="dxa"/>
+            <w:tcW w:w="1550" w:type="dxa"/>
             <w:vMerge/>
             <w:tcBorders>
               <w:top w:val="single" w:sz="4" w:space="0" w:color="A6A6A6"/>
@@ -2893,7 +2893,7 @@
         </w:tc>
         <w:tc>
           <w:tcPr>
-            <w:tcW w:w="3700" w:type="dxa"/>
+            <w:tcW w:w="3350" w:type="dxa"/>
             <w:vMerge/>
             <w:tcBorders>
               <w:top w:val="single" w:sz="4" w:space="0" w:color="A6A6A6"/>
@@ -2948,7 +2948,7 @@
         </w:tc>
         <w:tc>
           <w:tcPr>
-            <w:tcW w:w="1200" w:type="dxa"/>
+            <w:tcW w:w="1500" w:type="dxa"/>
             <w:tcBorders>
               <w:top w:val="single" w:sz="4" w:space="0" w:color="A6A6A6"/>
               <w:left w:val="single" w:sz="4" w:space="0" w:color="A6A6A6"/>
@@ -2979,7 +2979,7 @@
         </w:tc>
         <w:tc>
           <w:tcPr>
-            <w:tcW w:w="1500" w:type="dxa"/>
+            <w:tcW w:w="1400" w:type="dxa"/>
             <w:tcBorders>
               <w:top w:val="single" w:sz="4" w:space="0" w:color="A6A6A6"/>
               <w:left w:val="single" w:sz="4" w:space="0" w:color="A6A6A6"/>
@@ -3036,7 +3036,7 @@
         </w:trPr>
         <w:tc>
           <w:tcPr>
-            <w:tcW w:w="1400" w:type="dxa"/>
+            <w:tcW w:w="1550" w:type="dxa"/>
             <w:vMerge w:val="restart"/>
             <w:tcBorders>
               <w:top w:val="single" w:sz="18" w:space="0" w:color="317647"/>
@@ -3071,7 +3071,7 @@
         </w:tc>
         <w:tc>
           <w:tcPr>
-            <w:tcW w:w="3700" w:type="dxa"/>
+            <w:tcW w:w="3350" w:type="dxa"/>
             <w:vMerge w:val="restart"/>
             <w:tcBorders>
               <w:top w:val="single" w:sz="18" w:space="0" w:color="317647"/>
@@ -3154,7 +3154,7 @@
         </w:tc>
         <w:tc>
           <w:tcPr>
-            <w:tcW w:w="1200" w:type="dxa"/>
+            <w:tcW w:w="1500" w:type="dxa"/>
             <w:tcBorders>
               <w:top w:val="single" w:sz="18" w:space="0" w:color="317647"/>
               <w:left w:val="single" w:sz="4" w:space="0" w:color="A6A6A6"/>
@@ -3185,7 +3185,7 @@
         </w:tc>
         <w:tc>
           <w:tcPr>
-            <w:tcW w:w="1500" w:type="dxa"/>
+            <w:tcW w:w="1400" w:type="dxa"/>
             <w:tcBorders>
               <w:top w:val="single" w:sz="18" w:space="0" w:color="317647"/>
               <w:left w:val="single" w:sz="4" w:space="0" w:color="A6A6A6"/>
@@ -3225,7 +3225,7 @@
         </w:trPr>
         <w:tc>
           <w:tcPr>
-            <w:tcW w:w="1400" w:type="dxa"/>
+            <w:tcW w:w="1550" w:type="dxa"/>
             <w:vMerge/>
             <w:tcBorders>
               <w:top w:val="single" w:sz="4" w:space="0" w:color="A6A6A6"/>
@@ -3249,7 +3249,7 @@
         </w:tc>
         <w:tc>
           <w:tcPr>
-            <w:tcW w:w="3700" w:type="dxa"/>
+            <w:tcW w:w="3350" w:type="dxa"/>
             <w:vMerge/>
             <w:tcBorders>
               <w:top w:val="single" w:sz="4" w:space="0" w:color="A6A6A6"/>
@@ -3304,7 +3304,7 @@
         </w:tc>
         <w:tc>
           <w:tcPr>
-            <w:tcW w:w="1200" w:type="dxa"/>
+            <w:tcW w:w="1500" w:type="dxa"/>
             <w:tcBorders>
               <w:top w:val="single" w:sz="4" w:space="0" w:color="A6A6A6"/>
               <w:left w:val="single" w:sz="4" w:space="0" w:color="A6A6A6"/>
@@ -3335,7 +3335,7 @@
         </w:tc>
         <w:tc>
           <w:tcPr>
-            <w:tcW w:w="1500" w:type="dxa"/>
+            <w:tcW w:w="1400" w:type="dxa"/>
             <w:tcBorders>
               <w:top w:val="single" w:sz="4" w:space="0" w:color="A6A6A6"/>
               <w:left w:val="single" w:sz="4" w:space="0" w:color="A6A6A6"/>
@@ -3375,7 +3375,7 @@
         </w:trPr>
         <w:tc>
           <w:tcPr>
-            <w:tcW w:w="1400" w:type="dxa"/>
+            <w:tcW w:w="1550" w:type="dxa"/>
             <w:vMerge/>
             <w:tcBorders>
               <w:top w:val="single" w:sz="4" w:space="0" w:color="A6A6A6"/>
@@ -3399,7 +3399,7 @@
         </w:tc>
         <w:tc>
           <w:tcPr>
-            <w:tcW w:w="3700" w:type="dxa"/>
+            <w:tcW w:w="3350" w:type="dxa"/>
             <w:vMerge/>
             <w:tcBorders>
               <w:top w:val="single" w:sz="4" w:space="0" w:color="A6A6A6"/>
@@ -3454,7 +3454,7 @@
         </w:tc>
         <w:tc>
           <w:tcPr>
-            <w:tcW w:w="1200" w:type="dxa"/>
+            <w:tcW w:w="1500" w:type="dxa"/>
             <w:tcBorders>
               <w:top w:val="single" w:sz="4" w:space="0" w:color="A6A6A6"/>
               <w:left w:val="single" w:sz="4" w:space="0" w:color="A6A6A6"/>
@@ -3485,7 +3485,7 @@
         </w:tc>
         <w:tc>
           <w:tcPr>
-            <w:tcW w:w="1500" w:type="dxa"/>
+            <w:tcW w:w="1400" w:type="dxa"/>
             <w:tcBorders>
               <w:top w:val="single" w:sz="4" w:space="0" w:color="A6A6A6"/>
               <w:left w:val="single" w:sz="4" w:space="0" w:color="A6A6A6"/>

</xml_diff>

<commit_message>
Clubs note v4: shorter prompts, keep club rows together
Co-Authored-By: Claude Sonnet 5.5 <noreply@anthropic.com>
Claude-Session: https://claude.ai/code/session_01NZxYRpYCJka2jQFTHvmGQ5
</commit_message>
<xml_diff>
--- a/Clubs_Extrascolaires_Note_Parents_BCBS_v4.docx
+++ b/Clubs_Extrascolaires_Note_Parents_BCBS_v4.docx
@@ -734,7 +734,7 @@
                 <w:sz w:val="16"/>
                 <w:szCs w:val="16"/>
               </w:rPr>
-              <w:t xml:space="preserve">Une seule image réaliste et lumineuse : trois élèves africains de 9 à 13 ans en uniforme scolaire, dans la cour d'une école de Yaoundé. Une fille se lave les mains à un lavabo, un garçon applique un pansement à un camarade, une trousse de premiers secours au premier plan. Ambiance joyeuse, couleurs vives, format paysage 3:2. Texte sur l'image : uniquement le titre « Health Club », aucun autre texte, aucun logo, aucun filigrane.</w:t>
+              <w:t xml:space="preserve">Image réaliste et lumineuse : trois élèves africains de 9 à 13 ans en uniforme, cour d'une école de Yaoundé. Une fille se lave les mains, un garçon pose un pansement à un camarade, trousse de premiers secours au premier plan. Paysage 3:2. Texte : seulement le titre « Health Club », ni logo ni filigrane.</w:t>
             </w:r>
           </w:p>
         </w:tc>
@@ -922,7 +922,7 @@
                 <w:sz w:val="16"/>
                 <w:szCs w:val="16"/>
               </w:rPr>
-              <w:t xml:space="preserve">Une seule image réaliste et lumineuse : quatre élèves africains de 9 à 13 ans en uniforme scolaire arrosent et plantent dans un jardin d'école verdoyant, avec trois bacs de tri colorés (plastique, papier, verre) à l'arrière-plan. Ambiance joyeuse, soleil, format paysage 3:2. Texte sur l'image : uniquement le titre « Environment Club », aucun autre texte, aucun logo, aucun filigrane.</w:t>
+              <w:t xml:space="preserve">Image réaliste et lumineuse : quatre élèves africains de 9 à 13 ans en uniforme plantent et arrosent dans un jardin d'école, trois bacs de tri colorés à l'arrière-plan. Soleil, ambiance joyeuse, paysage 3:2. Texte : seulement le titre « Environment Club », ni logo ni filigrane.</w:t>
             </w:r>
           </w:p>
         </w:tc>
@@ -1110,7 +1110,7 @@
                 <w:sz w:val="16"/>
                 <w:szCs w:val="16"/>
               </w:rPr>
-              <w:t xml:space="preserve">Une seule image réaliste et chaleureuse : trois élèves africains de 9 à 13 ans en atelier d'arts plastiques, l'un peint un paysage coloré, une fille fabrique un bracelet de perles, une table avec sacs à main, babouches et bijoux traditionnels africains. Couleurs vives, lumière naturelle, format paysage 3:2. Texte sur l'image : uniquement le titre « Arts &amp; Plastic Club », aucun autre texte, aucun logo, aucun filigrane.</w:t>
+              <w:t xml:space="preserve">Image réaliste et chaleureuse : trois élèves africains de 9 à 13 ans en atelier d'arts plastiques, l'un peint un paysage, une fille fait un bracelet de perles, sacs et bijoux traditionnels sur la table. Couleurs vives, paysage 3:2. Texte : seulement le titre « Arts &amp; Plastic Club », ni logo ni filigrane.</w:t>
             </w:r>
           </w:p>
         </w:tc>
@@ -1236,6 +1236,7 @@
           </w:tcPr>
           <w:p>
             <w:pPr>
+              <w:keepNext/>
               <w:spacing w:before="0" w:after="0" w:line="259" w:lineRule="auto"/>
             </w:pPr>
             <w:r>
@@ -1272,6 +1273,7 @@
           </w:tcPr>
           <w:p>
             <w:pPr>
+              <w:keepNext/>
               <w:spacing w:before="0" w:after="40" w:line="259" w:lineRule="auto"/>
             </w:pPr>
             <w:r>
@@ -1288,6 +1290,7 @@
           </w:p>
           <w:p>
             <w:pPr>
+              <w:keepNext/>
               <w:spacing w:before="0" w:after="0" w:line="259" w:lineRule="auto"/>
             </w:pPr>
             <w:r>
@@ -1299,7 +1302,7 @@
                 <w:sz w:val="16"/>
                 <w:szCs w:val="16"/>
               </w:rPr>
-              <w:t xml:space="preserve">Une seule image réaliste et dynamique : un jeune reporter africain de 12 ans tient un micro devant une caméra sur trépied, une élève derrière lui prend une photo avec un appareil reflex, un petit podium de théâtre en arrière-plan. École de Yaoundé, lumière naturelle, format paysage 3:2. Texte sur l'image : uniquement le titre « Media Club », aucun autre texte, aucun logo, aucun filigrane.</w:t>
+              <w:t xml:space="preserve">Image réaliste et dynamique : un jeune reporter africain de 12 ans tient un micro devant une caméra sur trépied, une élève prend une photo avec un reflex, petit podium de théâtre derrière. Lumière naturelle, paysage 3:2. Texte : seulement le titre « Media Club », ni logo ni filigrane.</w:t>
             </w:r>
           </w:p>
         </w:tc>
@@ -1322,6 +1325,7 @@
           </w:tcPr>
           <w:p>
             <w:pPr>
+              <w:keepNext/>
               <w:spacing w:before="0" w:after="0" w:line="259" w:lineRule="auto"/>
             </w:pPr>
             <w:r>
@@ -1353,6 +1357,7 @@
           </w:tcPr>
           <w:p>
             <w:pPr>
+              <w:keepNext/>
               <w:spacing w:before="0" w:after="0" w:line="259" w:lineRule="auto"/>
             </w:pPr>
             <w:r>
@@ -1384,6 +1389,7 @@
           </w:tcPr>
           <w:p>
             <w:pPr>
+              <w:keepNext/>
               <w:spacing w:before="0" w:after="0" w:line="259" w:lineRule="auto"/>
               <w:jc w:val="center"/>
             </w:pPr>
@@ -1425,6 +1431,7 @@
           </w:tcPr>
           <w:p>
             <w:pPr>
+              <w:keepNext/>
               <w:spacing w:after="0"/>
             </w:pPr>
           </w:p>
@@ -1449,6 +1456,7 @@
           </w:tcPr>
           <w:p>
             <w:pPr>
+              <w:keepNext/>
               <w:spacing w:after="0"/>
             </w:pPr>
           </w:p>
@@ -1472,6 +1480,7 @@
           </w:tcPr>
           <w:p>
             <w:pPr>
+              <w:keepNext/>
               <w:spacing w:before="0" w:after="0" w:line="259" w:lineRule="auto"/>
             </w:pPr>
             <w:r>
@@ -1503,6 +1512,7 @@
           </w:tcPr>
           <w:p>
             <w:pPr>
+              <w:keepNext/>
               <w:spacing w:before="0" w:after="0" w:line="259" w:lineRule="auto"/>
             </w:pPr>
             <w:r>
@@ -1534,6 +1544,7 @@
           </w:tcPr>
           <w:p>
             <w:pPr>
+              <w:keepNext/>
               <w:spacing w:before="0" w:after="0" w:line="259" w:lineRule="auto"/>
               <w:jc w:val="center"/>
             </w:pPr>
@@ -1575,6 +1586,7 @@
           </w:tcPr>
           <w:p>
             <w:pPr>
+              <w:keepNext/>
               <w:spacing w:after="0"/>
             </w:pPr>
           </w:p>
@@ -1599,6 +1611,7 @@
           </w:tcPr>
           <w:p>
             <w:pPr>
+              <w:keepNext/>
               <w:spacing w:after="0"/>
             </w:pPr>
           </w:p>
@@ -1622,6 +1635,7 @@
           </w:tcPr>
           <w:p>
             <w:pPr>
+              <w:keepNext/>
               <w:spacing w:before="0" w:after="0" w:line="259" w:lineRule="auto"/>
             </w:pPr>
             <w:r>
@@ -1653,6 +1667,7 @@
           </w:tcPr>
           <w:p>
             <w:pPr>
+              <w:keepNext/>
               <w:spacing w:before="0" w:after="0" w:line="259" w:lineRule="auto"/>
             </w:pPr>
             <w:r>
@@ -1684,6 +1699,7 @@
           </w:tcPr>
           <w:p>
             <w:pPr>
+              <w:keepNext/>
               <w:spacing w:before="0" w:after="0" w:line="259" w:lineRule="auto"/>
               <w:jc w:val="center"/>
             </w:pPr>
@@ -1875,6 +1891,7 @@
           </w:tcPr>
           <w:p>
             <w:pPr>
+              <w:keepNext/>
               <w:spacing w:before="0" w:after="0" w:line="259" w:lineRule="auto"/>
             </w:pPr>
             <w:r>
@@ -1911,6 +1928,7 @@
           </w:tcPr>
           <w:p>
             <w:pPr>
+              <w:keepNext/>
               <w:spacing w:before="0" w:after="40" w:line="259" w:lineRule="auto"/>
             </w:pPr>
             <w:r>
@@ -1927,6 +1945,7 @@
           </w:p>
           <w:p>
             <w:pPr>
+              <w:keepNext/>
               <w:spacing w:before="0" w:after="0" w:line="259" w:lineRule="auto"/>
             </w:pPr>
             <w:r>
@@ -1938,7 +1957,7 @@
                 <w:sz w:val="16"/>
                 <w:szCs w:val="16"/>
               </w:rPr>
-              <w:t xml:space="preserve">Une seule image réaliste et joyeuse : quatre élèves africains de 9 à 13 ans font de la musique ensemble, une fille chante au micro, un garçon joue de la guitare, une autre du piano, un élève de la flûte, instruments bien visibles, notes de musique colorées discrètes. Format paysage 3:2. Texte sur l'image : uniquement le titre « Music Club », aucun autre texte, aucun logo, aucun filigrane.</w:t>
+              <w:t xml:space="preserve">Image réaliste et joyeuse : quatre élèves africains de 9 à 13 ans font de la musique ensemble : une fille chante au micro, un garçon à la guitare, une élève au piano, un élève à la flûte. Paysage 3:2. Texte : seulement le titre « Music Club », ni logo ni filigrane.</w:t>
             </w:r>
           </w:p>
         </w:tc>
@@ -1961,6 +1980,7 @@
           </w:tcPr>
           <w:p>
             <w:pPr>
+              <w:keepNext/>
               <w:spacing w:before="0" w:after="0" w:line="259" w:lineRule="auto"/>
             </w:pPr>
             <w:r>
@@ -1992,6 +2012,7 @@
           </w:tcPr>
           <w:p>
             <w:pPr>
+              <w:keepNext/>
               <w:spacing w:before="0" w:after="0" w:line="259" w:lineRule="auto"/>
             </w:pPr>
             <w:r>
@@ -2023,6 +2044,7 @@
           </w:tcPr>
           <w:p>
             <w:pPr>
+              <w:keepNext/>
               <w:spacing w:before="0" w:after="0" w:line="259" w:lineRule="auto"/>
               <w:jc w:val="center"/>
             </w:pPr>
@@ -2064,6 +2086,7 @@
           </w:tcPr>
           <w:p>
             <w:pPr>
+              <w:keepNext/>
               <w:spacing w:after="0"/>
             </w:pPr>
           </w:p>
@@ -2088,6 +2111,7 @@
           </w:tcPr>
           <w:p>
             <w:pPr>
+              <w:keepNext/>
               <w:spacing w:after="0"/>
             </w:pPr>
           </w:p>
@@ -2111,6 +2135,7 @@
           </w:tcPr>
           <w:p>
             <w:pPr>
+              <w:keepNext/>
               <w:spacing w:before="0" w:after="0" w:line="259" w:lineRule="auto"/>
             </w:pPr>
             <w:r>
@@ -2142,6 +2167,7 @@
           </w:tcPr>
           <w:p>
             <w:pPr>
+              <w:keepNext/>
               <w:spacing w:before="0" w:after="0" w:line="259" w:lineRule="auto"/>
             </w:pPr>
             <w:r>
@@ -2173,6 +2199,7 @@
           </w:tcPr>
           <w:p>
             <w:pPr>
+              <w:keepNext/>
               <w:spacing w:before="0" w:after="0" w:line="259" w:lineRule="auto"/>
               <w:jc w:val="center"/>
             </w:pPr>
@@ -2214,6 +2241,7 @@
           </w:tcPr>
           <w:p>
             <w:pPr>
+              <w:keepNext/>
               <w:spacing w:after="0"/>
             </w:pPr>
           </w:p>
@@ -2238,6 +2266,7 @@
           </w:tcPr>
           <w:p>
             <w:pPr>
+              <w:keepNext/>
               <w:spacing w:after="0"/>
             </w:pPr>
           </w:p>
@@ -2261,6 +2290,7 @@
           </w:tcPr>
           <w:p>
             <w:pPr>
+              <w:keepNext/>
               <w:spacing w:before="0" w:after="0" w:line="259" w:lineRule="auto"/>
             </w:pPr>
             <w:r>
@@ -2292,6 +2322,7 @@
           </w:tcPr>
           <w:p>
             <w:pPr>
+              <w:keepNext/>
               <w:spacing w:before="0" w:after="0" w:line="259" w:lineRule="auto"/>
             </w:pPr>
             <w:r>
@@ -2323,6 +2354,7 @@
           </w:tcPr>
           <w:p>
             <w:pPr>
+              <w:keepNext/>
               <w:spacing w:before="0" w:after="0" w:line="259" w:lineRule="auto"/>
               <w:jc w:val="center"/>
             </w:pPr>
@@ -2514,6 +2546,7 @@
           </w:tcPr>
           <w:p>
             <w:pPr>
+              <w:keepNext/>
               <w:spacing w:before="0" w:after="0" w:line="259" w:lineRule="auto"/>
             </w:pPr>
             <w:r>
@@ -2550,6 +2583,7 @@
           </w:tcPr>
           <w:p>
             <w:pPr>
+              <w:keepNext/>
               <w:spacing w:before="0" w:after="40" w:line="259" w:lineRule="auto"/>
             </w:pPr>
             <w:r>
@@ -2566,6 +2600,7 @@
           </w:p>
           <w:p>
             <w:pPr>
+              <w:keepNext/>
               <w:spacing w:before="0" w:after="0" w:line="259" w:lineRule="auto"/>
             </w:pPr>
             <w:r>
@@ -2577,7 +2612,7 @@
                 <w:sz w:val="16"/>
                 <w:szCs w:val="16"/>
               </w:rPr>
-              <w:t xml:space="preserve">Une seule image réaliste et énergique : des élèves africains de 9 à 14 ans en tenue de sport sur un terrain d'école à Yaoundé, un match de football au premier plan, un ballon de basket, un ballon de volley et une raquette de tennis visibles au second plan. Lumière de plein soleil, format paysage 3:2. Texte sur l'image : uniquement le titre « Sports Club », aucun autre texte, aucun logo, aucun filigrane.</w:t>
+              <w:t xml:space="preserve">Image réaliste et énergique : élèves africains de 9 à 14 ans en tenue de sport sur un terrain d'école, match de football au premier plan, ballons de basket et de volley et raquette de tennis visibles derrière. Plein soleil, paysage 3:2. Texte : seulement le titre « Sports Club », ni logo ni filigrane.</w:t>
             </w:r>
           </w:p>
         </w:tc>
@@ -2600,6 +2635,7 @@
           </w:tcPr>
           <w:p>
             <w:pPr>
+              <w:keepNext/>
               <w:spacing w:before="0" w:after="0" w:line="259" w:lineRule="auto"/>
             </w:pPr>
             <w:r>
@@ -2631,6 +2667,7 @@
           </w:tcPr>
           <w:p>
             <w:pPr>
+              <w:keepNext/>
               <w:spacing w:before="0" w:after="0" w:line="259" w:lineRule="auto"/>
             </w:pPr>
             <w:r>
@@ -2662,6 +2699,7 @@
           </w:tcPr>
           <w:p>
             <w:pPr>
+              <w:keepNext/>
               <w:spacing w:before="0" w:after="0" w:line="259" w:lineRule="auto"/>
               <w:jc w:val="center"/>
             </w:pPr>
@@ -2679,6 +2717,7 @@
           </w:p>
           <w:p>
             <w:pPr>
+              <w:keepNext/>
               <w:spacing w:before="0" w:after="0" w:line="259" w:lineRule="auto"/>
               <w:jc w:val="center"/>
             </w:pPr>
@@ -2720,6 +2759,7 @@
           </w:tcPr>
           <w:p>
             <w:pPr>
+              <w:keepNext/>
               <w:spacing w:after="0"/>
             </w:pPr>
           </w:p>
@@ -2744,6 +2784,7 @@
           </w:tcPr>
           <w:p>
             <w:pPr>
+              <w:keepNext/>
               <w:spacing w:after="0"/>
             </w:pPr>
           </w:p>
@@ -2767,6 +2808,7 @@
           </w:tcPr>
           <w:p>
             <w:pPr>
+              <w:keepNext/>
               <w:spacing w:before="0" w:after="0" w:line="259" w:lineRule="auto"/>
             </w:pPr>
             <w:r>
@@ -2798,6 +2840,7 @@
           </w:tcPr>
           <w:p>
             <w:pPr>
+              <w:keepNext/>
               <w:spacing w:before="0" w:after="0" w:line="259" w:lineRule="auto"/>
             </w:pPr>
             <w:r>
@@ -2829,6 +2872,7 @@
           </w:tcPr>
           <w:p>
             <w:pPr>
+              <w:keepNext/>
               <w:spacing w:before="0" w:after="0" w:line="259" w:lineRule="auto"/>
               <w:jc w:val="center"/>
             </w:pPr>
@@ -2846,6 +2890,7 @@
           </w:p>
           <w:p>
             <w:pPr>
+              <w:keepNext/>
               <w:spacing w:before="0" w:after="0" w:line="259" w:lineRule="auto"/>
               <w:jc w:val="center"/>
             </w:pPr>
@@ -3054,6 +3099,7 @@
           </w:tcPr>
           <w:p>
             <w:pPr>
+              <w:keepNext/>
               <w:spacing w:before="0" w:after="0" w:line="259" w:lineRule="auto"/>
             </w:pPr>
             <w:r>
@@ -3090,6 +3136,7 @@
           </w:tcPr>
           <w:p>
             <w:pPr>
+              <w:keepNext/>
               <w:spacing w:before="0" w:after="40" w:line="259" w:lineRule="auto"/>
             </w:pPr>
             <w:r>
@@ -3106,6 +3153,7 @@
           </w:p>
           <w:p>
             <w:pPr>
+              <w:keepNext/>
               <w:spacing w:before="0" w:after="0" w:line="259" w:lineRule="auto"/>
             </w:pPr>
             <w:r>
@@ -3117,7 +3165,7 @@
                 <w:sz w:val="16"/>
                 <w:szCs w:val="16"/>
               </w:rPr>
-              <w:t xml:space="preserve">Une seule image réaliste et moderne : quatre élèves africains de 11 à 14 ans en uniforme scolaire devant des ordinateurs dans une salle informatique d'école, l'un écrit du code sur l'écran, un autre crée un petit jeu vidéo, un enseignant les guide. Lumière naturelle, format paysage 3:2. Texte sur l'image : uniquement le titre « ICT Club », aucun autre texte, aucun logo, aucun filigrane.</w:t>
+              <w:t xml:space="preserve">Image réaliste et moderne : quatre élèves africains de 11 à 14 ans en uniforme devant des ordinateurs, l'un écrit du code, un autre crée un petit jeu vidéo, un enseignant les guide. Salle informatique, paysage 3:2. Texte : seulement le titre « ICT Club », ni logo ni filigrane.</w:t>
             </w:r>
           </w:p>
         </w:tc>
@@ -3140,6 +3188,7 @@
           </w:tcPr>
           <w:p>
             <w:pPr>
+              <w:keepNext/>
               <w:spacing w:before="0" w:after="0" w:line="259" w:lineRule="auto"/>
             </w:pPr>
             <w:r>
@@ -3171,6 +3220,7 @@
           </w:tcPr>
           <w:p>
             <w:pPr>
+              <w:keepNext/>
               <w:spacing w:before="0" w:after="0" w:line="259" w:lineRule="auto"/>
             </w:pPr>
             <w:r>
@@ -3202,6 +3252,7 @@
           </w:tcPr>
           <w:p>
             <w:pPr>
+              <w:keepNext/>
               <w:spacing w:before="0" w:after="0" w:line="259" w:lineRule="auto"/>
               <w:jc w:val="center"/>
             </w:pPr>
@@ -3243,6 +3294,7 @@
           </w:tcPr>
           <w:p>
             <w:pPr>
+              <w:keepNext/>
               <w:spacing w:after="0"/>
             </w:pPr>
           </w:p>
@@ -3267,6 +3319,7 @@
           </w:tcPr>
           <w:p>
             <w:pPr>
+              <w:keepNext/>
               <w:spacing w:after="0"/>
             </w:pPr>
           </w:p>
@@ -3290,6 +3343,7 @@
           </w:tcPr>
           <w:p>
             <w:pPr>
+              <w:keepNext/>
               <w:spacing w:before="0" w:after="0" w:line="259" w:lineRule="auto"/>
             </w:pPr>
             <w:r>
@@ -3321,6 +3375,7 @@
           </w:tcPr>
           <w:p>
             <w:pPr>
+              <w:keepNext/>
               <w:spacing w:before="0" w:after="0" w:line="259" w:lineRule="auto"/>
             </w:pPr>
             <w:r>
@@ -3352,6 +3407,7 @@
           </w:tcPr>
           <w:p>
             <w:pPr>
+              <w:keepNext/>
               <w:spacing w:before="0" w:after="0" w:line="259" w:lineRule="auto"/>
               <w:jc w:val="center"/>
             </w:pPr>

</xml_diff>